<commit_message>
Sviluppo Template Method: Fine Codice & Inizio UML
</commit_message>
<xml_diff>
--- a/designPattern/templateMethod/TemplateMethod.docx
+++ b/designPattern/templateMethod/TemplateMethod.docx
@@ -27,7 +27,315 @@
     </w:p>
     <w:p>
       <w:r>
-        <w:t>L’implementazione di questo design pattern può essere fatta con un interfaccia oppure con una classe astratta, entrambe espongono i metodi da delegare dell’algoritmo.</w:t>
+        <w:t xml:space="preserve">L’implementazione di questo design pattern può essere fatta con </w:t>
+      </w:r>
+      <w:r>
+        <w:t>un’interfaccia</w:t>
+      </w:r>
+      <w:r>
+        <w:t xml:space="preserve"> oppure con una classe astratta, entrambe espongono i metodi da delegare dell’algoritmo.</w:t>
+      </w:r>
+      <w:r>
+        <w:t xml:space="preserve"> Questo porta però a dei pro e contro, in primis possiamo importare il codice che altrimenti sarebbe duplicato in varie componenti del nostro sistema, i client possono modificare punti specifici dell’algoritmo ma allo stesso modo questa potrebbe essere una limitazione perché c’è già uno scheletro da seguire non modificabile e più passi abbiamo nel nostro template più sarà difficile manutenerlo.</w:t>
+      </w:r>
+    </w:p>
+    <w:p>
+      <w:r>
+        <w:t xml:space="preserve">Per l’implementazione di questo pattern prenderemo un caso reale in cui </w:t>
+      </w:r>
+      <w:r>
+        <w:t>un’azienda</w:t>
+      </w:r>
+      <w:r>
+        <w:t xml:space="preserve"> </w:t>
+      </w:r>
+      <w:r>
+        <w:t xml:space="preserve">di nome </w:t>
+      </w:r>
+      <w:r>
+        <w:rPr>
+          <w:i/>
+          <w:iCs/>
+        </w:rPr>
+        <w:t xml:space="preserve">“AllSafe” </w:t>
+      </w:r>
+      <w:r>
+        <w:t>ha un varco che viene controllato ad ogni accesso, questa azienda farà passare soltanto il personale della propria azienda e non delle altre mentre un tecnico specializzato con un numero di autenticazione valido verrà fatto passare anche se non appartiene all’azienda stessa.</w:t>
+      </w:r>
+    </w:p>
+    <w:p>
+      <w:pPr>
+        <w:rPr>
+          <w:noProof/>
+        </w:rPr>
+      </w:pPr>
+      <w:r>
+        <w:t xml:space="preserve">Iniziamo con il definire lo scheletro del nostro algoritmo nella classe </w:t>
+      </w:r>
+      <w:r>
+        <w:rPr>
+          <w:i/>
+          <w:iCs/>
+        </w:rPr>
+        <w:t>“GestioneAccesso”</w:t>
+      </w:r>
+      <w:r>
+        <w:t>:</w:t>
+      </w:r>
+      <w:r>
+        <w:rPr>
+          <w:noProof/>
+        </w:rPr>
+        <w:t xml:space="preserve"> </w:t>
+      </w:r>
+      <w:r>
+        <w:drawing>
+          <wp:inline distT="0" distB="0" distL="0" distR="0" wp14:anchorId="2FAE15DE" wp14:editId="604C2DAF">
+            <wp:extent cx="6120130" cy="4040505"/>
+            <wp:effectExtent l="0" t="0" r="0" b="0"/>
+            <wp:docPr id="242892647" name="Immagine 1"/>
+            <wp:cNvGraphicFramePr>
+              <a:graphicFrameLocks xmlns:a="http://schemas.openxmlformats.org/drawingml/2006/main" noChangeAspect="1"/>
+            </wp:cNvGraphicFramePr>
+            <a:graphic xmlns:a="http://schemas.openxmlformats.org/drawingml/2006/main">
+              <a:graphicData uri="http://schemas.openxmlformats.org/drawingml/2006/picture">
+                <pic:pic xmlns:pic="http://schemas.openxmlformats.org/drawingml/2006/picture">
+                  <pic:nvPicPr>
+                    <pic:cNvPr id="242892647" name=""/>
+                    <pic:cNvPicPr/>
+                  </pic:nvPicPr>
+                  <pic:blipFill>
+                    <a:blip r:embed="rId4"/>
+                    <a:stretch>
+                      <a:fillRect/>
+                    </a:stretch>
+                  </pic:blipFill>
+                  <pic:spPr>
+                    <a:xfrm>
+                      <a:off x="0" y="0"/>
+                      <a:ext cx="6120130" cy="4040505"/>
+                    </a:xfrm>
+                    <a:prstGeom prst="rect">
+                      <a:avLst/>
+                    </a:prstGeom>
+                  </pic:spPr>
+                </pic:pic>
+              </a:graphicData>
+            </a:graphic>
+          </wp:inline>
+        </w:drawing>
+      </w:r>
+      <w:r>
+        <w:rPr>
+          <w:noProof/>
+        </w:rPr>
+        <w:t xml:space="preserve">Si può notare subito come primo metodo lo scheletro di tutto l’algoritmo di accesso e subito dopo la </w:t>
+      </w:r>
+      <w:r>
+        <w:rPr>
+          <w:noProof/>
+        </w:rPr>
+        <w:lastRenderedPageBreak/>
+        <w:t>sua scomposizione in piccole parti, le parti che dovranno rimanere standard sono segnate come final mentre quelle che devono essere implementate a seconda della classe che eredita vengono dichiarati abstract, sono proprio quelli i  punti del nostro algoritmo che vogliamo cambiare in base a chi si presenta davanti il varco.</w:t>
+      </w:r>
+      <w:r>
+        <w:rPr>
+          <w:noProof/>
+        </w:rPr>
+        <w:t xml:space="preserve"> Ora implementiamo due classi che rappresentano le due entità che si possono presentare davanti il varco: </w:t>
+      </w:r>
+      <w:r>
+        <w:rPr>
+          <w:i/>
+          <w:iCs/>
+          <w:noProof/>
+        </w:rPr>
+        <w:t>“Personale”:</w:t>
+      </w:r>
+      <w:r>
+        <w:rPr>
+          <w:noProof/>
+        </w:rPr>
+        <w:t xml:space="preserve"> </w:t>
+      </w:r>
+      <w:r>
+        <w:rPr>
+          <w:i/>
+          <w:iCs/>
+          <w:noProof/>
+        </w:rPr>
+        <w:drawing>
+          <wp:inline distT="0" distB="0" distL="0" distR="0" wp14:anchorId="2FF74FB9" wp14:editId="747BB8D4">
+            <wp:extent cx="6120130" cy="4387215"/>
+            <wp:effectExtent l="0" t="0" r="0" b="0"/>
+            <wp:docPr id="76005280" name="Immagine 1"/>
+            <wp:cNvGraphicFramePr>
+              <a:graphicFrameLocks xmlns:a="http://schemas.openxmlformats.org/drawingml/2006/main" noChangeAspect="1"/>
+            </wp:cNvGraphicFramePr>
+            <a:graphic xmlns:a="http://schemas.openxmlformats.org/drawingml/2006/main">
+              <a:graphicData uri="http://schemas.openxmlformats.org/drawingml/2006/picture">
+                <pic:pic xmlns:pic="http://schemas.openxmlformats.org/drawingml/2006/picture">
+                  <pic:nvPicPr>
+                    <pic:cNvPr id="76005280" name=""/>
+                    <pic:cNvPicPr/>
+                  </pic:nvPicPr>
+                  <pic:blipFill>
+                    <a:blip r:embed="rId5"/>
+                    <a:stretch>
+                      <a:fillRect/>
+                    </a:stretch>
+                  </pic:blipFill>
+                  <pic:spPr>
+                    <a:xfrm>
+                      <a:off x="0" y="0"/>
+                      <a:ext cx="6120130" cy="4387215"/>
+                    </a:xfrm>
+                    <a:prstGeom prst="rect">
+                      <a:avLst/>
+                    </a:prstGeom>
+                  </pic:spPr>
+                </pic:pic>
+              </a:graphicData>
+            </a:graphic>
+          </wp:inline>
+        </w:drawing>
+      </w:r>
+      <w:r>
+        <w:rPr>
+          <w:noProof/>
+        </w:rPr>
+        <w:t>Ed infine la nostra entità tecnico:</w:t>
+      </w:r>
+      <w:r>
+        <w:rPr>
+          <w:noProof/>
+        </w:rPr>
+        <w:t xml:space="preserve"> </w:t>
+      </w:r>
+      <w:r>
+        <w:rPr>
+          <w:noProof/>
+        </w:rPr>
+        <w:lastRenderedPageBreak/>
+        <w:drawing>
+          <wp:inline distT="0" distB="0" distL="0" distR="0" wp14:anchorId="41AFA73F" wp14:editId="620E44AB">
+            <wp:extent cx="6120130" cy="5414645"/>
+            <wp:effectExtent l="0" t="0" r="0" b="0"/>
+            <wp:docPr id="1563519826" name="Immagine 1"/>
+            <wp:cNvGraphicFramePr>
+              <a:graphicFrameLocks xmlns:a="http://schemas.openxmlformats.org/drawingml/2006/main" noChangeAspect="1"/>
+            </wp:cNvGraphicFramePr>
+            <a:graphic xmlns:a="http://schemas.openxmlformats.org/drawingml/2006/main">
+              <a:graphicData uri="http://schemas.openxmlformats.org/drawingml/2006/picture">
+                <pic:pic xmlns:pic="http://schemas.openxmlformats.org/drawingml/2006/picture">
+                  <pic:nvPicPr>
+                    <pic:cNvPr id="1563519826" name=""/>
+                    <pic:cNvPicPr/>
+                  </pic:nvPicPr>
+                  <pic:blipFill>
+                    <a:blip r:embed="rId6"/>
+                    <a:stretch>
+                      <a:fillRect/>
+                    </a:stretch>
+                  </pic:blipFill>
+                  <pic:spPr>
+                    <a:xfrm>
+                      <a:off x="0" y="0"/>
+                      <a:ext cx="6120130" cy="5414645"/>
+                    </a:xfrm>
+                    <a:prstGeom prst="rect">
+                      <a:avLst/>
+                    </a:prstGeom>
+                  </pic:spPr>
+                </pic:pic>
+              </a:graphicData>
+            </a:graphic>
+          </wp:inline>
+        </w:drawing>
+      </w:r>
+      <w:r>
+        <w:rPr>
+          <w:noProof/>
+        </w:rPr>
+        <w:t xml:space="preserve">Le due classi differiscono di poco, infatti ad uno viene chiesto il codice </w:t>
+      </w:r>
+      <w:r>
+        <w:rPr>
+          <w:noProof/>
+        </w:rPr>
+        <w:t>dell’autorizzazione</w:t>
+      </w:r>
+      <w:r>
+        <w:rPr>
+          <w:noProof/>
+        </w:rPr>
+        <w:t xml:space="preserve"> e all’altro il nome dell’azienda, non c’è bisogno però per entrambi di riscrivere tutto il codice presente nella classe astratta, anche se in questo esempio il codice dentro di essa è poco si immagini quando il codice è molto più grande, ripeterlo 2 oppure n volte sarebbe uno spreco enorme</w:t>
+      </w:r>
+      <w:r>
+        <w:rPr>
+          <w:noProof/>
+        </w:rPr>
+        <w:t xml:space="preserve">. </w:t>
+      </w:r>
+    </w:p>
+    <w:p>
+      <w:pPr>
+        <w:rPr>
+          <w:noProof/>
+        </w:rPr>
+      </w:pPr>
+      <w:r>
+        <w:rPr>
+          <w:noProof/>
+        </w:rPr>
+        <w:lastRenderedPageBreak/>
+        <w:t xml:space="preserve">Per completezza mostriamo il funzionamento con una piccola classe di testing: </w:t>
+      </w:r>
+      <w:r>
+        <w:rPr>
+          <w:noProof/>
+        </w:rPr>
+        <w:drawing>
+          <wp:inline distT="0" distB="0" distL="0" distR="0" wp14:anchorId="21C065B8" wp14:editId="53AC38FC">
+            <wp:extent cx="6096000" cy="4779776"/>
+            <wp:effectExtent l="0" t="0" r="0" b="1905"/>
+            <wp:docPr id="638829582" name="Immagine 1"/>
+            <wp:cNvGraphicFramePr>
+              <a:graphicFrameLocks xmlns:a="http://schemas.openxmlformats.org/drawingml/2006/main" noChangeAspect="1"/>
+            </wp:cNvGraphicFramePr>
+            <a:graphic xmlns:a="http://schemas.openxmlformats.org/drawingml/2006/main">
+              <a:graphicData uri="http://schemas.openxmlformats.org/drawingml/2006/picture">
+                <pic:pic xmlns:pic="http://schemas.openxmlformats.org/drawingml/2006/picture">
+                  <pic:nvPicPr>
+                    <pic:cNvPr id="638829582" name=""/>
+                    <pic:cNvPicPr/>
+                  </pic:nvPicPr>
+                  <pic:blipFill>
+                    <a:blip r:embed="rId7"/>
+                    <a:stretch>
+                      <a:fillRect/>
+                    </a:stretch>
+                  </pic:blipFill>
+                  <pic:spPr>
+                    <a:xfrm>
+                      <a:off x="0" y="0"/>
+                      <a:ext cx="6132488" cy="4808386"/>
+                    </a:xfrm>
+                    <a:prstGeom prst="rect">
+                      <a:avLst/>
+                    </a:prstGeom>
+                  </pic:spPr>
+                </pic:pic>
+              </a:graphicData>
+            </a:graphic>
+          </wp:inline>
+        </w:drawing>
+      </w:r>
+      <w:r>
+        <w:rPr>
+          <w:noProof/>
+        </w:rPr>
+        <w:t>Il design pattern in questione quindi ci aiuta a ridefinire solo piccole porzioni del nostro algoritmo monolitico, il diagramma UML è:</w:t>
       </w:r>
     </w:p>
     <w:sectPr>
@@ -643,7 +951,6 @@
   <w:style w:type="character" w:default="1" w:styleId="Carpredefinitoparagrafo">
     <w:name w:val="Default Paragraph Font"/>
     <w:uiPriority w:val="1"/>
-    <w:semiHidden/>
     <w:unhideWhenUsed/>
   </w:style>
   <w:style w:type="table" w:default="1" w:styleId="Tabellanormale">

</xml_diff>

<commit_message>
Aggiunta Design Pattern: Template Method
</commit_message>
<xml_diff>
--- a/designPattern/templateMethod/TemplateMethod.docx
+++ b/designPattern/templateMethod/TemplateMethod.docx
@@ -57,7 +57,23 @@
           <w:i/>
           <w:iCs/>
         </w:rPr>
-        <w:t xml:space="preserve">“AllSafe” </w:t>
+        <w:t>“</w:t>
+      </w:r>
+      <w:proofErr w:type="spellStart"/>
+      <w:r>
+        <w:rPr>
+          <w:i/>
+          <w:iCs/>
+        </w:rPr>
+        <w:t>AllSafe</w:t>
+      </w:r>
+      <w:proofErr w:type="spellEnd"/>
+      <w:r>
+        <w:rPr>
+          <w:i/>
+          <w:iCs/>
+        </w:rPr>
+        <w:t xml:space="preserve">” </w:t>
       </w:r>
       <w:r>
         <w:t>ha un varco che viene controllato ad ogni accesso, questa azienda farà passare soltanto il personale della propria azienda e non delle altre mentre un tecnico specializzato con un numero di autenticazione valido verrà fatto passare anche se non appartiene all’azienda stessa.</w:t>
@@ -77,7 +93,23 @@
           <w:i/>
           <w:iCs/>
         </w:rPr>
-        <w:t>“GestioneAccesso”</w:t>
+        <w:t>“</w:t>
+      </w:r>
+      <w:proofErr w:type="spellStart"/>
+      <w:r>
+        <w:rPr>
+          <w:i/>
+          <w:iCs/>
+        </w:rPr>
+        <w:t>GestioneAccesso</w:t>
+      </w:r>
+      <w:proofErr w:type="spellEnd"/>
+      <w:r>
+        <w:rPr>
+          <w:i/>
+          <w:iCs/>
+        </w:rPr>
+        <w:t>”</w:t>
       </w:r>
       <w:r>
         <w:t>:</w:t>
@@ -89,6 +121,9 @@
         <w:t xml:space="preserve"> </w:t>
       </w:r>
       <w:r>
+        <w:rPr>
+          <w:noProof/>
+        </w:rPr>
         <w:drawing>
           <wp:inline distT="0" distB="0" distL="0" distR="0" wp14:anchorId="2FAE15DE" wp14:editId="604C2DAF">
             <wp:extent cx="6120130" cy="4040505"/>
@@ -336,6 +371,52 @@
           <w:noProof/>
         </w:rPr>
         <w:t>Il design pattern in questione quindi ci aiuta a ridefinire solo piccole porzioni del nostro algoritmo monolitico, il diagramma UML è:</w:t>
+      </w:r>
+      <w:r>
+        <w:rPr>
+          <w:noProof/>
+        </w:rPr>
+        <w:drawing>
+          <wp:inline distT="0" distB="0" distL="0" distR="0" wp14:anchorId="667F9DD1" wp14:editId="28A9F0B5">
+            <wp:extent cx="5631488" cy="3695700"/>
+            <wp:effectExtent l="0" t="0" r="7620" b="0"/>
+            <wp:docPr id="559409506" name="Immagine 1"/>
+            <wp:cNvGraphicFramePr>
+              <a:graphicFrameLocks xmlns:a="http://schemas.openxmlformats.org/drawingml/2006/main" noChangeAspect="1"/>
+            </wp:cNvGraphicFramePr>
+            <a:graphic xmlns:a="http://schemas.openxmlformats.org/drawingml/2006/main">
+              <a:graphicData uri="http://schemas.openxmlformats.org/drawingml/2006/picture">
+                <pic:pic xmlns:pic="http://schemas.openxmlformats.org/drawingml/2006/picture">
+                  <pic:nvPicPr>
+                    <pic:cNvPr id="559409506" name="Immagine 559409506"/>
+                    <pic:cNvPicPr/>
+                  </pic:nvPicPr>
+                  <pic:blipFill>
+                    <a:blip r:embed="rId8">
+                      <a:extLst>
+                        <a:ext uri="{28A0092B-C50C-407E-A947-70E740481C1C}">
+                          <a14:useLocalDpi xmlns:a14="http://schemas.microsoft.com/office/drawing/2010/main" val="0"/>
+                        </a:ext>
+                      </a:extLst>
+                    </a:blip>
+                    <a:stretch>
+                      <a:fillRect/>
+                    </a:stretch>
+                  </pic:blipFill>
+                  <pic:spPr>
+                    <a:xfrm>
+                      <a:off x="0" y="0"/>
+                      <a:ext cx="5655175" cy="3711245"/>
+                    </a:xfrm>
+                    <a:prstGeom prst="rect">
+                      <a:avLst/>
+                    </a:prstGeom>
+                  </pic:spPr>
+                </pic:pic>
+              </a:graphicData>
+            </a:graphic>
+          </wp:inline>
+        </w:drawing>
       </w:r>
     </w:p>
     <w:sectPr>
@@ -951,6 +1032,7 @@
   <w:style w:type="character" w:default="1" w:styleId="Carpredefinitoparagrafo">
     <w:name w:val="Default Paragraph Font"/>
     <w:uiPriority w:val="1"/>
+    <w:semiHidden/>
     <w:unhideWhenUsed/>
   </w:style>
   <w:style w:type="table" w:default="1" w:styleId="Tabellanormale">

</xml_diff>